<commit_message>
Update Assignment 5 document
</commit_message>
<xml_diff>
--- a/Rezaei_Parvaneh_BDA400_A05.docx
+++ b/Rezaei_Parvaneh_BDA400_A05.docx
@@ -99,14 +99,12 @@
         </w:rPr>
         <w:t xml:space="preserve"> Parvaneh Rezaei</w:t>
       </w:r>
-    </w:p>
-    <w:p>
-      <w:pPr>
-        <w:jc w:val="center"/>
-        <w:rPr>
-          <w:rFonts w:asciiTheme="majorBidi" w:hAnsiTheme="majorBidi" w:cstheme="majorBidi"/>
-        </w:rPr>
-      </w:pPr>
+      <w:r>
+        <w:rPr>
+          <w:rFonts w:asciiTheme="majorBidi" w:hAnsiTheme="majorBidi" w:cstheme="majorBidi"/>
+        </w:rPr>
+        <w:br/>
+      </w:r>
       <w:r>
         <w:rPr>
           <w:rFonts w:asciiTheme="majorBidi" w:hAnsiTheme="majorBidi" w:cstheme="majorBidi"/>
@@ -119,16 +117,14 @@
         <w:rPr>
           <w:rFonts w:asciiTheme="majorBidi" w:hAnsiTheme="majorBidi" w:cstheme="majorBidi"/>
         </w:rPr>
-        <w:t xml:space="preserve"> [paste your repository link here]</w:t>
-      </w:r>
-    </w:p>
-    <w:p>
-      <w:pPr>
-        <w:jc w:val="center"/>
-        <w:rPr>
-          <w:rFonts w:asciiTheme="majorBidi" w:hAnsiTheme="majorBidi" w:cstheme="majorBidi"/>
-        </w:rPr>
-      </w:pPr>
+        <w:t xml:space="preserve"> https://github.com/Pary2003/BDA400_Assignment5</w:t>
+      </w:r>
+      <w:r>
+        <w:rPr>
+          <w:rFonts w:asciiTheme="majorBidi" w:hAnsiTheme="majorBidi" w:cstheme="majorBidi"/>
+        </w:rPr>
+        <w:br/>
+      </w:r>
       <w:r>
         <w:rPr>
           <w:rFonts w:asciiTheme="majorBidi" w:hAnsiTheme="majorBidi" w:cstheme="majorBidi"/>
@@ -267,6 +263,17 @@
       <w:pPr>
         <w:rPr>
           <w:rFonts w:asciiTheme="majorBidi" w:hAnsiTheme="majorBidi" w:cstheme="majorBidi"/>
+          <w:b/>
+          <w:bCs/>
+        </w:rPr>
+      </w:pPr>
+    </w:p>
+    <w:p>
+      <w:pPr>
+        <w:rPr>
+          <w:rFonts w:asciiTheme="majorBidi" w:hAnsiTheme="majorBidi" w:cstheme="majorBidi"/>
+          <w:b/>
+          <w:bCs/>
         </w:rPr>
       </w:pPr>
     </w:p>
@@ -298,21 +305,7 @@
         <w:rPr>
           <w:rFonts w:asciiTheme="majorBidi" w:hAnsiTheme="majorBidi" w:cstheme="majorBidi"/>
         </w:rPr>
-        <w:t xml:space="preserve">This assignment implements nine technical analysis functions in R using standard core R functions without relying on existing technical analysis libraries. Each indicator was developed in a separate R script according to the provided templates and pseudocode. The implementations include Simple Moving Average (SMA), Exponential Moving Average (EMA), Moving Average Convergence Divergence (MACD), Standard Deviation, Linear Regression, Relative Strength Index (RSI), Stochastic RSI, Crossover, and </w:t>
-      </w:r>
-      <w:proofErr w:type="spellStart"/>
-      <w:r>
-        <w:rPr>
-          <w:rFonts w:asciiTheme="majorBidi" w:hAnsiTheme="majorBidi" w:cstheme="majorBidi"/>
-        </w:rPr>
-        <w:t>Crossunder</w:t>
-      </w:r>
-      <w:proofErr w:type="spellEnd"/>
-      <w:r>
-        <w:rPr>
-          <w:rFonts w:asciiTheme="majorBidi" w:hAnsiTheme="majorBidi" w:cstheme="majorBidi"/>
-        </w:rPr>
-        <w:t>.</w:t>
+        <w:t>This assignment implements nine technical analysis functions in R using standard core R functions without relying on existing technical analysis libraries. Each indicator was developed in a separate R script according to the provided templates and pseudocode. The implementations include Simple Moving Average (SMA), Exponential Moving Average (EMA), Moving Average Convergence Divergence (MACD), Standard Deviation, Linear Regression, Relative Strength Index (RSI), Stochastic RSI, Crossover, and Crossunder.</w:t>
       </w:r>
     </w:p>
     <w:p>
@@ -376,21 +369,7 @@
         <w:rPr>
           <w:rFonts w:asciiTheme="majorBidi" w:hAnsiTheme="majorBidi" w:cstheme="majorBidi"/>
         </w:rPr>
-        <w:t xml:space="preserve">Open the </w:t>
-      </w:r>
-      <w:proofErr w:type="gramStart"/>
-      <w:r>
-        <w:rPr>
-          <w:rFonts w:asciiTheme="majorBidi" w:hAnsiTheme="majorBidi" w:cstheme="majorBidi"/>
-        </w:rPr>
-        <w:t>required .R</w:t>
-      </w:r>
-      <w:proofErr w:type="gramEnd"/>
-      <w:r>
-        <w:rPr>
-          <w:rFonts w:asciiTheme="majorBidi" w:hAnsiTheme="majorBidi" w:cstheme="majorBidi"/>
-        </w:rPr>
-        <w:t xml:space="preserve"> script from the Files pane.</w:t>
+        <w:t>Open the required .R script from the Files pane.</w:t>
       </w:r>
     </w:p>
     <w:p>
@@ -489,115 +468,7 @@
         <w:rPr>
           <w:rFonts w:asciiTheme="majorBidi" w:hAnsiTheme="majorBidi" w:cstheme="majorBidi"/>
         </w:rPr>
-        <w:t xml:space="preserve">Some functions depend on other functions. For example, </w:t>
-      </w:r>
-      <w:proofErr w:type="spellStart"/>
-      <w:proofErr w:type="gramStart"/>
-      <w:r>
-        <w:rPr>
-          <w:rFonts w:asciiTheme="majorBidi" w:hAnsiTheme="majorBidi" w:cstheme="majorBidi"/>
-        </w:rPr>
-        <w:t>macd</w:t>
-      </w:r>
-      <w:proofErr w:type="spellEnd"/>
-      <w:r>
-        <w:rPr>
-          <w:rFonts w:asciiTheme="majorBidi" w:hAnsiTheme="majorBidi" w:cstheme="majorBidi"/>
-        </w:rPr>
-        <w:t>(</w:t>
-      </w:r>
-      <w:proofErr w:type="gramEnd"/>
-      <w:r>
-        <w:rPr>
-          <w:rFonts w:asciiTheme="majorBidi" w:hAnsiTheme="majorBidi" w:cstheme="majorBidi"/>
-        </w:rPr>
-        <w:t xml:space="preserve">) uses </w:t>
-      </w:r>
-      <w:proofErr w:type="gramStart"/>
-      <w:r>
-        <w:rPr>
-          <w:rFonts w:asciiTheme="majorBidi" w:hAnsiTheme="majorBidi" w:cstheme="majorBidi"/>
-        </w:rPr>
-        <w:t>ema(</w:t>
-      </w:r>
-      <w:proofErr w:type="gramEnd"/>
-      <w:r>
-        <w:rPr>
-          <w:rFonts w:asciiTheme="majorBidi" w:hAnsiTheme="majorBidi" w:cstheme="majorBidi"/>
-        </w:rPr>
-        <w:t xml:space="preserve">), and </w:t>
-      </w:r>
-      <w:proofErr w:type="spellStart"/>
-      <w:r>
-        <w:rPr>
-          <w:rFonts w:asciiTheme="majorBidi" w:hAnsiTheme="majorBidi" w:cstheme="majorBidi"/>
-        </w:rPr>
-        <w:t>stoch_</w:t>
-      </w:r>
-      <w:proofErr w:type="gramStart"/>
-      <w:r>
-        <w:rPr>
-          <w:rFonts w:asciiTheme="majorBidi" w:hAnsiTheme="majorBidi" w:cstheme="majorBidi"/>
-        </w:rPr>
-        <w:t>rsi</w:t>
-      </w:r>
-      <w:proofErr w:type="spellEnd"/>
-      <w:r>
-        <w:rPr>
-          <w:rFonts w:asciiTheme="majorBidi" w:hAnsiTheme="majorBidi" w:cstheme="majorBidi"/>
-        </w:rPr>
-        <w:t>(</w:t>
-      </w:r>
-      <w:proofErr w:type="gramEnd"/>
-      <w:r>
-        <w:rPr>
-          <w:rFonts w:asciiTheme="majorBidi" w:hAnsiTheme="majorBidi" w:cstheme="majorBidi"/>
-        </w:rPr>
-        <w:t xml:space="preserve">) uses </w:t>
-      </w:r>
-      <w:proofErr w:type="spellStart"/>
-      <w:proofErr w:type="gramStart"/>
-      <w:r>
-        <w:rPr>
-          <w:rFonts w:asciiTheme="majorBidi" w:hAnsiTheme="majorBidi" w:cstheme="majorBidi"/>
-        </w:rPr>
-        <w:t>rsi</w:t>
-      </w:r>
-      <w:proofErr w:type="spellEnd"/>
-      <w:r>
-        <w:rPr>
-          <w:rFonts w:asciiTheme="majorBidi" w:hAnsiTheme="majorBidi" w:cstheme="majorBidi"/>
-        </w:rPr>
-        <w:t>(</w:t>
-      </w:r>
-      <w:proofErr w:type="gramEnd"/>
-      <w:r>
-        <w:rPr>
-          <w:rFonts w:asciiTheme="majorBidi" w:hAnsiTheme="majorBidi" w:cstheme="majorBidi"/>
-        </w:rPr>
-        <w:t xml:space="preserve">) and </w:t>
-      </w:r>
-      <w:proofErr w:type="spellStart"/>
-      <w:proofErr w:type="gramStart"/>
-      <w:r>
-        <w:rPr>
-          <w:rFonts w:asciiTheme="majorBidi" w:hAnsiTheme="majorBidi" w:cstheme="majorBidi"/>
-        </w:rPr>
-        <w:t>sma</w:t>
-      </w:r>
-      <w:proofErr w:type="spellEnd"/>
-      <w:r>
-        <w:rPr>
-          <w:rFonts w:asciiTheme="majorBidi" w:hAnsiTheme="majorBidi" w:cstheme="majorBidi"/>
-        </w:rPr>
-        <w:t>(</w:t>
-      </w:r>
-      <w:proofErr w:type="gramEnd"/>
-      <w:r>
-        <w:rPr>
-          <w:rFonts w:asciiTheme="majorBidi" w:hAnsiTheme="majorBidi" w:cstheme="majorBidi"/>
-        </w:rPr>
-        <w:t>). These required functions should be loaded first.</w:t>
+        <w:t>Some functions depend on other functions. For example, macd() uses ema(), and stoch_rsi() uses rsi() and sma(). These required functions should be loaded first.</w:t>
       </w:r>
     </w:p>
     <w:p>
@@ -668,20 +539,21 @@
           <w:lang w:eastAsia="en-CA"/>
           <w14:ligatures w14:val="none"/>
         </w:rPr>
-        <w:t xml:space="preserve"> </w:t>
-      </w:r>
-      <w:proofErr w:type="spellStart"/>
-      <w:proofErr w:type="gramStart"/>
-      <w:r>
+        <w:t xml:space="preserve"> sma(data, period)</w:t>
+      </w:r>
+    </w:p>
+    <w:p>
+      <w:pPr>
+        <w:pStyle w:val="ListParagraph"/>
+        <w:spacing w:before="100" w:beforeAutospacing="1" w:after="100" w:afterAutospacing="1" w:line="240" w:lineRule="auto"/>
+        <w:jc w:val="both"/>
         <w:rPr>
           <w:rFonts w:asciiTheme="majorBidi" w:eastAsia="Times New Roman" w:hAnsiTheme="majorBidi" w:cstheme="majorBidi"/>
           <w:kern w:val="0"/>
           <w:lang w:eastAsia="en-CA"/>
           <w14:ligatures w14:val="none"/>
         </w:rPr>
-        <w:t>sma</w:t>
-      </w:r>
-      <w:proofErr w:type="spellEnd"/>
+      </w:pPr>
       <w:r>
         <w:rPr>
           <w:rFonts w:asciiTheme="majorBidi" w:eastAsia="Times New Roman" w:hAnsiTheme="majorBidi" w:cstheme="majorBidi"/>
@@ -689,127 +561,95 @@
           <w:lang w:eastAsia="en-CA"/>
           <w14:ligatures w14:val="none"/>
         </w:rPr>
-        <w:t>(</w:t>
-      </w:r>
-      <w:proofErr w:type="gramEnd"/>
-      <w:r>
+        <w:t>The Simple Moving Average (SMA) calculates the average of a specified number of consecutive data points. The function first checks that the dataset contains enough values for the selected period. It then moves through the data one window at a time, calculates the sum of the values in each window, and divides the sum by the period.</w:t>
+      </w:r>
+    </w:p>
+    <w:p>
+      <w:pPr>
+        <w:pStyle w:val="ListParagraph"/>
+        <w:spacing w:before="100" w:beforeAutospacing="1" w:after="100" w:afterAutospacing="1" w:line="240" w:lineRule="auto"/>
+        <w:jc w:val="both"/>
         <w:rPr>
           <w:rFonts w:asciiTheme="majorBidi" w:eastAsia="Times New Roman" w:hAnsiTheme="majorBidi" w:cstheme="majorBidi"/>
           <w:kern w:val="0"/>
           <w:lang w:eastAsia="en-CA"/>
           <w14:ligatures w14:val="none"/>
         </w:rPr>
-        <w:t>data, period)</w:t>
-      </w:r>
-    </w:p>
-    <w:p>
-      <w:pPr>
-        <w:pStyle w:val="ListParagraph"/>
-        <w:spacing w:before="100" w:beforeAutospacing="1" w:after="100" w:afterAutospacing="1" w:line="240" w:lineRule="auto"/>
-        <w:jc w:val="both"/>
+      </w:pPr>
+      <w:r>
         <w:rPr>
           <w:rFonts w:asciiTheme="majorBidi" w:eastAsia="Times New Roman" w:hAnsiTheme="majorBidi" w:cstheme="majorBidi"/>
           <w:kern w:val="0"/>
           <w:lang w:eastAsia="en-CA"/>
           <w14:ligatures w14:val="none"/>
         </w:rPr>
-      </w:pPr>
-      <w:r>
+        <w:t>The SMA helps smooth short-term fluctuations in data and makes the overall trend easier to identify.</w:t>
+      </w:r>
+    </w:p>
+    <w:p>
+      <w:pPr>
+        <w:pStyle w:val="ListParagraph"/>
+        <w:spacing w:before="100" w:beforeAutospacing="1" w:after="100" w:afterAutospacing="1" w:line="240" w:lineRule="auto"/>
+        <w:jc w:val="both"/>
         <w:rPr>
           <w:rFonts w:asciiTheme="majorBidi" w:eastAsia="Times New Roman" w:hAnsiTheme="majorBidi" w:cstheme="majorBidi"/>
           <w:kern w:val="0"/>
           <w:lang w:eastAsia="en-CA"/>
           <w14:ligatures w14:val="none"/>
         </w:rPr>
-        <w:t>The Simple Moving Average (SMA) calculates the average of a specified number of consecutive data points. The function first checks that the dataset contains enough values for the selected period. It then moves through the data one window at a time, calculates the sum of the values in each window, and divides the sum by the period.</w:t>
-      </w:r>
-    </w:p>
-    <w:p>
-      <w:pPr>
-        <w:pStyle w:val="ListParagraph"/>
-        <w:spacing w:before="100" w:beforeAutospacing="1" w:after="100" w:afterAutospacing="1" w:line="240" w:lineRule="auto"/>
-        <w:jc w:val="both"/>
+      </w:pPr>
+      <w:r>
+        <w:rPr>
+          <w:rFonts w:asciiTheme="majorBidi" w:eastAsia="Times New Roman" w:hAnsiTheme="majorBidi" w:cstheme="majorBidi"/>
+          <w:b/>
+          <w:bCs/>
+          <w:kern w:val="0"/>
+          <w:lang w:eastAsia="en-CA"/>
+          <w14:ligatures w14:val="none"/>
+        </w:rPr>
+        <w:t>Implementation:</w:t>
+      </w:r>
+      <w:r>
         <w:rPr>
           <w:rFonts w:asciiTheme="majorBidi" w:eastAsia="Times New Roman" w:hAnsiTheme="majorBidi" w:cstheme="majorBidi"/>
           <w:kern w:val="0"/>
           <w:lang w:eastAsia="en-CA"/>
           <w14:ligatures w14:val="none"/>
         </w:rPr>
-      </w:pPr>
-      <w:r>
+        <w:br/>
+        <w:t>The function uses a loop to create each moving window and calculates its mean using the values in that window. The calculated SMA values are stored in a vector and returned by the function.</w:t>
+      </w:r>
+    </w:p>
+    <w:p>
+      <w:pPr>
+        <w:pStyle w:val="ListParagraph"/>
+        <w:spacing w:before="100" w:beforeAutospacing="1" w:after="100" w:afterAutospacing="1" w:line="240" w:lineRule="auto"/>
+        <w:jc w:val="both"/>
         <w:rPr>
           <w:rFonts w:asciiTheme="majorBidi" w:eastAsia="Times New Roman" w:hAnsiTheme="majorBidi" w:cstheme="majorBidi"/>
           <w:kern w:val="0"/>
           <w:lang w:eastAsia="en-CA"/>
           <w14:ligatures w14:val="none"/>
         </w:rPr>
-        <w:t>The SMA helps smooth short-term fluctuations in data and makes the overall trend easier to identify.</w:t>
-      </w:r>
-    </w:p>
-    <w:p>
-      <w:pPr>
-        <w:pStyle w:val="ListParagraph"/>
-        <w:spacing w:before="100" w:beforeAutospacing="1" w:after="100" w:afterAutospacing="1" w:line="240" w:lineRule="auto"/>
-        <w:jc w:val="both"/>
+      </w:pPr>
+      <w:r>
+        <w:rPr>
+          <w:rFonts w:asciiTheme="majorBidi" w:eastAsia="Times New Roman" w:hAnsiTheme="majorBidi" w:cstheme="majorBidi"/>
+          <w:b/>
+          <w:bCs/>
+          <w:kern w:val="0"/>
+          <w:lang w:eastAsia="en-CA"/>
+          <w14:ligatures w14:val="none"/>
+        </w:rPr>
+        <w:t>Example:</w:t>
+      </w:r>
+      <w:r>
         <w:rPr>
           <w:rFonts w:asciiTheme="majorBidi" w:eastAsia="Times New Roman" w:hAnsiTheme="majorBidi" w:cstheme="majorBidi"/>
           <w:kern w:val="0"/>
           <w:lang w:eastAsia="en-CA"/>
           <w14:ligatures w14:val="none"/>
         </w:rPr>
-      </w:pPr>
-      <w:r>
-        <w:rPr>
-          <w:rFonts w:asciiTheme="majorBidi" w:eastAsia="Times New Roman" w:hAnsiTheme="majorBidi" w:cstheme="majorBidi"/>
-          <w:b/>
-          <w:bCs/>
-          <w:kern w:val="0"/>
-          <w:lang w:eastAsia="en-CA"/>
-          <w14:ligatures w14:val="none"/>
-        </w:rPr>
-        <w:t>Implementation:</w:t>
-      </w:r>
-      <w:r>
-        <w:rPr>
-          <w:rFonts w:asciiTheme="majorBidi" w:eastAsia="Times New Roman" w:hAnsiTheme="majorBidi" w:cstheme="majorBidi"/>
-          <w:kern w:val="0"/>
-          <w:lang w:eastAsia="en-CA"/>
-          <w14:ligatures w14:val="none"/>
-        </w:rPr>
-        <w:br/>
-        <w:t>The function uses a loop to create each moving window and calculates its mean using the values in that window. The calculated SMA values are stored in a vector and returned by the function.</w:t>
-      </w:r>
-    </w:p>
-    <w:p>
-      <w:pPr>
-        <w:pStyle w:val="ListParagraph"/>
-        <w:spacing w:before="100" w:beforeAutospacing="1" w:after="100" w:afterAutospacing="1" w:line="240" w:lineRule="auto"/>
-        <w:jc w:val="both"/>
-        <w:rPr>
-          <w:rFonts w:asciiTheme="majorBidi" w:eastAsia="Times New Roman" w:hAnsiTheme="majorBidi" w:cstheme="majorBidi"/>
-          <w:kern w:val="0"/>
-          <w:lang w:eastAsia="en-CA"/>
-          <w14:ligatures w14:val="none"/>
-        </w:rPr>
-      </w:pPr>
-      <w:r>
-        <w:rPr>
-          <w:rFonts w:asciiTheme="majorBidi" w:eastAsia="Times New Roman" w:hAnsiTheme="majorBidi" w:cstheme="majorBidi"/>
-          <w:b/>
-          <w:bCs/>
-          <w:kern w:val="0"/>
-          <w:lang w:eastAsia="en-CA"/>
-          <w14:ligatures w14:val="none"/>
-        </w:rPr>
-        <w:t>Example:</w:t>
-      </w:r>
-      <w:r>
-        <w:rPr>
-          <w:rFonts w:asciiTheme="majorBidi" w:eastAsia="Times New Roman" w:hAnsiTheme="majorBidi" w:cstheme="majorBidi"/>
-          <w:kern w:val="0"/>
-          <w:lang w:eastAsia="en-CA"/>
-          <w14:ligatures w14:val="none"/>
-        </w:rPr>
         <w:br/>
         <w:t>For the sample data, a period of 3 is used to calculate the average of every three consecutive values.</w:t>
       </w:r>
@@ -852,21 +692,7 @@
         <w:rPr>
           <w:rFonts w:asciiTheme="majorBidi" w:hAnsiTheme="majorBidi" w:cstheme="majorBidi"/>
         </w:rPr>
-        <w:t xml:space="preserve"> </w:t>
-      </w:r>
-      <w:proofErr w:type="gramStart"/>
-      <w:r>
-        <w:rPr>
-          <w:rFonts w:asciiTheme="majorBidi" w:hAnsiTheme="majorBidi" w:cstheme="majorBidi"/>
-        </w:rPr>
-        <w:t>ema(</w:t>
-      </w:r>
-      <w:proofErr w:type="gramEnd"/>
-      <w:r>
-        <w:rPr>
-          <w:rFonts w:asciiTheme="majorBidi" w:hAnsiTheme="majorBidi" w:cstheme="majorBidi"/>
-        </w:rPr>
-        <w:t>data, period)</w:t>
+        <w:t xml:space="preserve"> ema(data, period)</w:t>
       </w:r>
     </w:p>
     <w:p>
@@ -964,48 +790,6 @@
         <w:ind w:left="360"/>
         <w:rPr>
           <w:rFonts w:asciiTheme="majorBidi" w:hAnsiTheme="majorBidi" w:cstheme="majorBidi"/>
-        </w:rPr>
-      </w:pPr>
-      <w:r>
-        <w:rPr>
-          <w:rFonts w:asciiTheme="majorBidi" w:hAnsiTheme="majorBidi" w:cstheme="majorBidi"/>
-        </w:rPr>
-        <w:t xml:space="preserve">Add this to your document and tell me </w:t>
-      </w:r>
-      <w:r>
-        <w:rPr>
-          <w:rFonts w:asciiTheme="majorBidi" w:hAnsiTheme="majorBidi" w:cstheme="majorBidi"/>
-          <w:b/>
-          <w:bCs/>
-        </w:rPr>
-        <w:t>done</w:t>
-      </w:r>
-      <w:r>
-        <w:rPr>
-          <w:rFonts w:asciiTheme="majorBidi" w:hAnsiTheme="majorBidi" w:cstheme="majorBidi"/>
-        </w:rPr>
-        <w:t xml:space="preserve">. Then we'll do </w:t>
-      </w:r>
-      <w:r>
-        <w:rPr>
-          <w:rFonts w:asciiTheme="majorBidi" w:hAnsiTheme="majorBidi" w:cstheme="majorBidi"/>
-          <w:b/>
-          <w:bCs/>
-        </w:rPr>
-        <w:t>3. MACD</w:t>
-      </w:r>
-      <w:r>
-        <w:rPr>
-          <w:rFonts w:asciiTheme="majorBidi" w:hAnsiTheme="majorBidi" w:cstheme="majorBidi"/>
-        </w:rPr>
-        <w:t>.</w:t>
-      </w:r>
-    </w:p>
-    <w:p>
-      <w:pPr>
-        <w:ind w:left="360"/>
-        <w:rPr>
-          <w:rFonts w:asciiTheme="majorBidi" w:hAnsiTheme="majorBidi" w:cstheme="majorBidi"/>
           <w:b/>
           <w:bCs/>
         </w:rPr>
@@ -1038,71 +822,7 @@
         <w:rPr>
           <w:rFonts w:asciiTheme="majorBidi" w:hAnsiTheme="majorBidi" w:cstheme="majorBidi"/>
         </w:rPr>
-        <w:t xml:space="preserve"> </w:t>
-      </w:r>
-      <w:proofErr w:type="spellStart"/>
-      <w:proofErr w:type="gramStart"/>
-      <w:r>
-        <w:rPr>
-          <w:rFonts w:asciiTheme="majorBidi" w:hAnsiTheme="majorBidi" w:cstheme="majorBidi"/>
-        </w:rPr>
-        <w:t>macd</w:t>
-      </w:r>
-      <w:proofErr w:type="spellEnd"/>
-      <w:r>
-        <w:rPr>
-          <w:rFonts w:asciiTheme="majorBidi" w:hAnsiTheme="majorBidi" w:cstheme="majorBidi"/>
-        </w:rPr>
-        <w:t>(</w:t>
-      </w:r>
-      <w:proofErr w:type="gramEnd"/>
-      <w:r>
-        <w:rPr>
-          <w:rFonts w:asciiTheme="majorBidi" w:hAnsiTheme="majorBidi" w:cstheme="majorBidi"/>
-        </w:rPr>
-        <w:t xml:space="preserve">data, </w:t>
-      </w:r>
-      <w:proofErr w:type="spellStart"/>
-      <w:r>
-        <w:rPr>
-          <w:rFonts w:asciiTheme="majorBidi" w:hAnsiTheme="majorBidi" w:cstheme="majorBidi"/>
-        </w:rPr>
-        <w:t>short_period</w:t>
-      </w:r>
-      <w:proofErr w:type="spellEnd"/>
-      <w:r>
-        <w:rPr>
-          <w:rFonts w:asciiTheme="majorBidi" w:hAnsiTheme="majorBidi" w:cstheme="majorBidi"/>
-        </w:rPr>
-        <w:t xml:space="preserve">, </w:t>
-      </w:r>
-      <w:proofErr w:type="spellStart"/>
-      <w:r>
-        <w:rPr>
-          <w:rFonts w:asciiTheme="majorBidi" w:hAnsiTheme="majorBidi" w:cstheme="majorBidi"/>
-        </w:rPr>
-        <w:t>long_period</w:t>
-      </w:r>
-      <w:proofErr w:type="spellEnd"/>
-      <w:r>
-        <w:rPr>
-          <w:rFonts w:asciiTheme="majorBidi" w:hAnsiTheme="majorBidi" w:cstheme="majorBidi"/>
-        </w:rPr>
-        <w:t xml:space="preserve">, </w:t>
-      </w:r>
-      <w:proofErr w:type="spellStart"/>
-      <w:r>
-        <w:rPr>
-          <w:rFonts w:asciiTheme="majorBidi" w:hAnsiTheme="majorBidi" w:cstheme="majorBidi"/>
-        </w:rPr>
-        <w:t>signal_period</w:t>
-      </w:r>
-      <w:proofErr w:type="spellEnd"/>
-      <w:r>
-        <w:rPr>
-          <w:rFonts w:asciiTheme="majorBidi" w:hAnsiTheme="majorBidi" w:cstheme="majorBidi"/>
-        </w:rPr>
-        <w:t>)</w:t>
+        <w:t xml:space="preserve"> macd(data, short_period, long_period, signal_period)</w:t>
       </w:r>
     </w:p>
     <w:p>
@@ -1139,21 +859,7 @@
           <w:rFonts w:asciiTheme="majorBidi" w:hAnsiTheme="majorBidi" w:cstheme="majorBidi"/>
         </w:rPr>
         <w:br/>
-        <w:t xml:space="preserve">The function first calculates the short-term and long-term EMA values using the </w:t>
-      </w:r>
-      <w:proofErr w:type="gramStart"/>
-      <w:r>
-        <w:rPr>
-          <w:rFonts w:asciiTheme="majorBidi" w:hAnsiTheme="majorBidi" w:cstheme="majorBidi"/>
-        </w:rPr>
-        <w:t>ema(</w:t>
-      </w:r>
-      <w:proofErr w:type="gramEnd"/>
-      <w:r>
-        <w:rPr>
-          <w:rFonts w:asciiTheme="majorBidi" w:hAnsiTheme="majorBidi" w:cstheme="majorBidi"/>
-        </w:rPr>
-        <w:t xml:space="preserve">) function. The </w:t>
+        <w:t xml:space="preserve">The function first calculates the short-term and long-term EMA values using the ema() function. The </w:t>
       </w:r>
       <w:r>
         <w:rPr>
@@ -1197,21 +903,7 @@
         <w:rPr>
           <w:rFonts w:asciiTheme="majorBidi" w:hAnsiTheme="majorBidi" w:cstheme="majorBidi"/>
         </w:rPr>
-        <w:t xml:space="preserve">The signal line is then calculated by applying the </w:t>
-      </w:r>
-      <w:proofErr w:type="gramStart"/>
-      <w:r>
-        <w:rPr>
-          <w:rFonts w:asciiTheme="majorBidi" w:hAnsiTheme="majorBidi" w:cstheme="majorBidi"/>
-        </w:rPr>
-        <w:t>ema(</w:t>
-      </w:r>
-      <w:proofErr w:type="gramEnd"/>
-      <w:r>
-        <w:rPr>
-          <w:rFonts w:asciiTheme="majorBidi" w:hAnsiTheme="majorBidi" w:cstheme="majorBidi"/>
-        </w:rPr>
-        <w:t>) function to the MACD line. Finally, the histogram is calculated as:</w:t>
+        <w:t>The signal line is then calculated by applying the ema() function to the MACD line. Finally, the histogram is calculated as:</w:t>
       </w:r>
     </w:p>
     <w:p>
@@ -1298,41 +990,27 @@
           <w:b/>
           <w:bCs/>
         </w:rPr>
+        <w:t>Function:</w:t>
+      </w:r>
+      <w:r>
+        <w:rPr>
+          <w:rFonts w:asciiTheme="majorBidi" w:hAnsiTheme="majorBidi" w:cstheme="majorBidi"/>
+        </w:rPr>
+        <w:t xml:space="preserve"> stdev(data)</w:t>
+      </w:r>
+    </w:p>
+    <w:p>
+      <w:pPr>
+        <w:ind w:left="360"/>
+        <w:rPr>
+          <w:rFonts w:asciiTheme="majorBidi" w:hAnsiTheme="majorBidi" w:cstheme="majorBidi"/>
+        </w:rPr>
+      </w:pPr>
+      <w:r>
+        <w:rPr>
+          <w:rFonts w:asciiTheme="majorBidi" w:hAnsiTheme="majorBidi" w:cstheme="majorBidi"/>
+        </w:rPr>
         <w:lastRenderedPageBreak/>
-        <w:t>Function:</w:t>
-      </w:r>
-      <w:r>
-        <w:rPr>
-          <w:rFonts w:asciiTheme="majorBidi" w:hAnsiTheme="majorBidi" w:cstheme="majorBidi"/>
-        </w:rPr>
-        <w:t xml:space="preserve"> </w:t>
-      </w:r>
-      <w:proofErr w:type="spellStart"/>
-      <w:r>
-        <w:rPr>
-          <w:rFonts w:asciiTheme="majorBidi" w:hAnsiTheme="majorBidi" w:cstheme="majorBidi"/>
-        </w:rPr>
-        <w:t>stdev</w:t>
-      </w:r>
-      <w:proofErr w:type="spellEnd"/>
-      <w:r>
-        <w:rPr>
-          <w:rFonts w:asciiTheme="majorBidi" w:hAnsiTheme="majorBidi" w:cstheme="majorBidi"/>
-        </w:rPr>
-        <w:t>(data)</w:t>
-      </w:r>
-    </w:p>
-    <w:p>
-      <w:pPr>
-        <w:ind w:left="360"/>
-        <w:rPr>
-          <w:rFonts w:asciiTheme="majorBidi" w:hAnsiTheme="majorBidi" w:cstheme="majorBidi"/>
-        </w:rPr>
-      </w:pPr>
-      <w:r>
-        <w:rPr>
-          <w:rFonts w:asciiTheme="majorBidi" w:hAnsiTheme="majorBidi" w:cstheme="majorBidi"/>
-        </w:rPr>
         <w:t>Standard Deviation measures how much the data values vary or spread out from their average. A smaller standard deviation indicates that values are closer to the mean, while a larger standard deviation indicates greater variation.</w:t>
       </w:r>
     </w:p>
@@ -1477,65 +1155,7 @@
         <w:rPr>
           <w:rFonts w:asciiTheme="majorBidi" w:hAnsiTheme="majorBidi" w:cstheme="majorBidi"/>
         </w:rPr>
-        <w:t xml:space="preserve"> </w:t>
-      </w:r>
-      <w:proofErr w:type="spellStart"/>
-      <w:proofErr w:type="gramStart"/>
-      <w:r>
-        <w:rPr>
-          <w:rFonts w:asciiTheme="majorBidi" w:hAnsiTheme="majorBidi" w:cstheme="majorBidi"/>
-        </w:rPr>
-        <w:t>linreg</w:t>
-      </w:r>
-      <w:proofErr w:type="spellEnd"/>
-      <w:r>
-        <w:rPr>
-          <w:rFonts w:asciiTheme="majorBidi" w:hAnsiTheme="majorBidi" w:cstheme="majorBidi"/>
-        </w:rPr>
-        <w:t>(</w:t>
-      </w:r>
-      <w:proofErr w:type="spellStart"/>
-      <w:proofErr w:type="gramEnd"/>
-      <w:r>
-        <w:rPr>
-          <w:rFonts w:asciiTheme="majorBidi" w:hAnsiTheme="majorBidi" w:cstheme="majorBidi"/>
-        </w:rPr>
-        <w:t>regressionSource</w:t>
-      </w:r>
-      <w:proofErr w:type="spellEnd"/>
-      <w:r>
-        <w:rPr>
-          <w:rFonts w:asciiTheme="majorBidi" w:hAnsiTheme="majorBidi" w:cstheme="majorBidi"/>
-        </w:rPr>
-        <w:t xml:space="preserve">, </w:t>
-      </w:r>
-      <w:proofErr w:type="spellStart"/>
-      <w:r>
-        <w:rPr>
-          <w:rFonts w:asciiTheme="majorBidi" w:hAnsiTheme="majorBidi" w:cstheme="majorBidi"/>
-        </w:rPr>
-        <w:t>regressionLength</w:t>
-      </w:r>
-      <w:proofErr w:type="spellEnd"/>
-      <w:r>
-        <w:rPr>
-          <w:rFonts w:asciiTheme="majorBidi" w:hAnsiTheme="majorBidi" w:cstheme="majorBidi"/>
-        </w:rPr>
-        <w:t xml:space="preserve">, </w:t>
-      </w:r>
-      <w:proofErr w:type="spellStart"/>
-      <w:r>
-        <w:rPr>
-          <w:rFonts w:asciiTheme="majorBidi" w:hAnsiTheme="majorBidi" w:cstheme="majorBidi"/>
-        </w:rPr>
-        <w:t>regressionOffset</w:t>
-      </w:r>
-      <w:proofErr w:type="spellEnd"/>
-      <w:r>
-        <w:rPr>
-          <w:rFonts w:asciiTheme="majorBidi" w:hAnsiTheme="majorBidi" w:cstheme="majorBidi"/>
-        </w:rPr>
-        <w:t>)</w:t>
+        <w:t xml:space="preserve"> linreg(regressionSource, regressionLength, regressionOffset)</w:t>
       </w:r>
     </w:p>
     <w:p>
@@ -1572,49 +1192,7 @@
           <w:rFonts w:asciiTheme="majorBidi" w:hAnsiTheme="majorBidi" w:cstheme="majorBidi"/>
         </w:rPr>
         <w:br/>
-        <w:t xml:space="preserve">The function first checks that </w:t>
-      </w:r>
-      <w:proofErr w:type="spellStart"/>
-      <w:r>
-        <w:rPr>
-          <w:rFonts w:asciiTheme="majorBidi" w:hAnsiTheme="majorBidi" w:cstheme="majorBidi"/>
-        </w:rPr>
-        <w:t>regressionLength</w:t>
-      </w:r>
-      <w:proofErr w:type="spellEnd"/>
-      <w:r>
-        <w:rPr>
-          <w:rFonts w:asciiTheme="majorBidi" w:hAnsiTheme="majorBidi" w:cstheme="majorBidi"/>
-        </w:rPr>
-        <w:t xml:space="preserve"> is not greater than the available data and that </w:t>
-      </w:r>
-      <w:proofErr w:type="spellStart"/>
-      <w:r>
-        <w:rPr>
-          <w:rFonts w:asciiTheme="majorBidi" w:hAnsiTheme="majorBidi" w:cstheme="majorBidi"/>
-        </w:rPr>
-        <w:t>regressionOffset</w:t>
-      </w:r>
-      <w:proofErr w:type="spellEnd"/>
-      <w:r>
-        <w:rPr>
-          <w:rFonts w:asciiTheme="majorBidi" w:hAnsiTheme="majorBidi" w:cstheme="majorBidi"/>
-        </w:rPr>
-        <w:t xml:space="preserve"> is less than </w:t>
-      </w:r>
-      <w:proofErr w:type="spellStart"/>
-      <w:r>
-        <w:rPr>
-          <w:rFonts w:asciiTheme="majorBidi" w:hAnsiTheme="majorBidi" w:cstheme="majorBidi"/>
-        </w:rPr>
-        <w:t>regressionLength</w:t>
-      </w:r>
-      <w:proofErr w:type="spellEnd"/>
-      <w:r>
-        <w:rPr>
-          <w:rFonts w:asciiTheme="majorBidi" w:hAnsiTheme="majorBidi" w:cstheme="majorBidi"/>
-        </w:rPr>
-        <w:t>. It then selects the required portion of the data based on the regression length and offset.</w:t>
+        <w:t>The function first checks that regressionLength is not greater than the available data and that regressionOffset is less than regressionLength. It then selects the required portion of the data based on the regression length and offset.</w:t>
       </w:r>
     </w:p>
     <w:p>
@@ -1689,14 +1267,12 @@
           <w:rFonts w:asciiTheme="majorBidi" w:hAnsiTheme="majorBidi" w:cstheme="majorBidi"/>
         </w:rPr>
       </w:pPr>
-      <w:proofErr w:type="spellStart"/>
       <w:r>
         <w:rPr>
           <w:rFonts w:asciiTheme="majorBidi" w:hAnsiTheme="majorBidi" w:cstheme="majorBidi"/>
         </w:rPr>
         <w:t>predicted_values</w:t>
       </w:r>
-      <w:proofErr w:type="spellEnd"/>
     </w:p>
     <w:p>
       <w:pPr>
@@ -1778,52 +1354,30 @@
           <w:b/>
           <w:bCs/>
         </w:rPr>
+        <w:t>6. Relative Strength Index (RSI)</w:t>
+      </w:r>
+    </w:p>
+    <w:p>
+      <w:pPr>
+        <w:ind w:left="360"/>
+        <w:rPr>
+          <w:rFonts w:asciiTheme="majorBidi" w:hAnsiTheme="majorBidi" w:cstheme="majorBidi"/>
+        </w:rPr>
+      </w:pPr>
+      <w:r>
+        <w:rPr>
+          <w:rFonts w:asciiTheme="majorBidi" w:hAnsiTheme="majorBidi" w:cstheme="majorBidi"/>
+          <w:b/>
+          <w:bCs/>
+        </w:rPr>
         <w:lastRenderedPageBreak/>
-        <w:t>6. Relative Strength Index (RSI)</w:t>
-      </w:r>
-    </w:p>
-    <w:p>
-      <w:pPr>
-        <w:ind w:left="360"/>
-        <w:rPr>
-          <w:rFonts w:asciiTheme="majorBidi" w:hAnsiTheme="majorBidi" w:cstheme="majorBidi"/>
-        </w:rPr>
-      </w:pPr>
-      <w:r>
-        <w:rPr>
-          <w:rFonts w:asciiTheme="majorBidi" w:hAnsiTheme="majorBidi" w:cstheme="majorBidi"/>
-          <w:b/>
-          <w:bCs/>
-        </w:rPr>
         <w:t>Function:</w:t>
       </w:r>
       <w:r>
         <w:rPr>
           <w:rFonts w:asciiTheme="majorBidi" w:hAnsiTheme="majorBidi" w:cstheme="majorBidi"/>
         </w:rPr>
-        <w:t xml:space="preserve"> </w:t>
-      </w:r>
-      <w:proofErr w:type="spellStart"/>
-      <w:proofErr w:type="gramStart"/>
-      <w:r>
-        <w:rPr>
-          <w:rFonts w:asciiTheme="majorBidi" w:hAnsiTheme="majorBidi" w:cstheme="majorBidi"/>
-        </w:rPr>
-        <w:t>rsi</w:t>
-      </w:r>
-      <w:proofErr w:type="spellEnd"/>
-      <w:r>
-        <w:rPr>
-          <w:rFonts w:asciiTheme="majorBidi" w:hAnsiTheme="majorBidi" w:cstheme="majorBidi"/>
-        </w:rPr>
-        <w:t>(</w:t>
-      </w:r>
-      <w:proofErr w:type="gramEnd"/>
-      <w:r>
-        <w:rPr>
-          <w:rFonts w:asciiTheme="majorBidi" w:hAnsiTheme="majorBidi" w:cstheme="majorBidi"/>
-        </w:rPr>
-        <w:t>data, period)</w:t>
+        <w:t xml:space="preserve"> rsi(data, period)</w:t>
       </w:r>
     </w:p>
     <w:p>
@@ -2003,25 +1557,7 @@
           <w:b/>
           <w:bCs/>
         </w:rPr>
-        <w:t>7. Stochastic RSI (</w:t>
-      </w:r>
-      <w:proofErr w:type="spellStart"/>
-      <w:r>
-        <w:rPr>
-          <w:rFonts w:asciiTheme="majorBidi" w:hAnsiTheme="majorBidi" w:cstheme="majorBidi"/>
-          <w:b/>
-          <w:bCs/>
-        </w:rPr>
-        <w:t>StochRSI</w:t>
-      </w:r>
-      <w:proofErr w:type="spellEnd"/>
-      <w:r>
-        <w:rPr>
-          <w:rFonts w:asciiTheme="majorBidi" w:hAnsiTheme="majorBidi" w:cstheme="majorBidi"/>
-          <w:b/>
-          <w:bCs/>
-        </w:rPr>
-        <w:t>)</w:t>
+        <w:t>7. Stochastic RSI (StochRSI)</w:t>
       </w:r>
     </w:p>
     <w:p>
@@ -2043,63 +1579,7 @@
         <w:rPr>
           <w:rFonts w:asciiTheme="majorBidi" w:hAnsiTheme="majorBidi" w:cstheme="majorBidi"/>
         </w:rPr>
-        <w:t xml:space="preserve"> </w:t>
-      </w:r>
-      <w:proofErr w:type="spellStart"/>
-      <w:r>
-        <w:rPr>
-          <w:rFonts w:asciiTheme="majorBidi" w:hAnsiTheme="majorBidi" w:cstheme="majorBidi"/>
-        </w:rPr>
-        <w:t>stoch_</w:t>
-      </w:r>
-      <w:proofErr w:type="gramStart"/>
-      <w:r>
-        <w:rPr>
-          <w:rFonts w:asciiTheme="majorBidi" w:hAnsiTheme="majorBidi" w:cstheme="majorBidi"/>
-        </w:rPr>
-        <w:t>rsi</w:t>
-      </w:r>
-      <w:proofErr w:type="spellEnd"/>
-      <w:r>
-        <w:rPr>
-          <w:rFonts w:asciiTheme="majorBidi" w:hAnsiTheme="majorBidi" w:cstheme="majorBidi"/>
-        </w:rPr>
-        <w:t>(</w:t>
-      </w:r>
-      <w:proofErr w:type="gramEnd"/>
-      <w:r>
-        <w:rPr>
-          <w:rFonts w:asciiTheme="majorBidi" w:hAnsiTheme="majorBidi" w:cstheme="majorBidi"/>
-        </w:rPr>
-        <w:t xml:space="preserve">data, period, </w:t>
-      </w:r>
-      <w:proofErr w:type="spellStart"/>
-      <w:r>
-        <w:rPr>
-          <w:rFonts w:asciiTheme="majorBidi" w:hAnsiTheme="majorBidi" w:cstheme="majorBidi"/>
-        </w:rPr>
-        <w:t>k_period</w:t>
-      </w:r>
-      <w:proofErr w:type="spellEnd"/>
-      <w:r>
-        <w:rPr>
-          <w:rFonts w:asciiTheme="majorBidi" w:hAnsiTheme="majorBidi" w:cstheme="majorBidi"/>
-        </w:rPr>
-        <w:t xml:space="preserve">, </w:t>
-      </w:r>
-      <w:proofErr w:type="spellStart"/>
-      <w:r>
-        <w:rPr>
-          <w:rFonts w:asciiTheme="majorBidi" w:hAnsiTheme="majorBidi" w:cstheme="majorBidi"/>
-        </w:rPr>
-        <w:t>d_period</w:t>
-      </w:r>
-      <w:proofErr w:type="spellEnd"/>
-      <w:r>
-        <w:rPr>
-          <w:rFonts w:asciiTheme="majorBidi" w:hAnsiTheme="majorBidi" w:cstheme="majorBidi"/>
-        </w:rPr>
-        <w:t>)</w:t>
+        <w:t xml:space="preserve"> stoch_rsi(data, period, k_period, d_period)</w:t>
       </w:r>
     </w:p>
     <w:p>
@@ -2136,29 +1616,7 @@
           <w:rFonts w:asciiTheme="majorBidi" w:hAnsiTheme="majorBidi" w:cstheme="majorBidi"/>
         </w:rPr>
         <w:br/>
-        <w:t xml:space="preserve">The function first calculates RSI values using the </w:t>
-      </w:r>
-      <w:proofErr w:type="spellStart"/>
-      <w:proofErr w:type="gramStart"/>
-      <w:r>
-        <w:rPr>
-          <w:rFonts w:asciiTheme="majorBidi" w:hAnsiTheme="majorBidi" w:cstheme="majorBidi"/>
-        </w:rPr>
-        <w:t>rsi</w:t>
-      </w:r>
-      <w:proofErr w:type="spellEnd"/>
-      <w:r>
-        <w:rPr>
-          <w:rFonts w:asciiTheme="majorBidi" w:hAnsiTheme="majorBidi" w:cstheme="majorBidi"/>
-        </w:rPr>
-        <w:t>(</w:t>
-      </w:r>
-      <w:proofErr w:type="gramEnd"/>
-      <w:r>
-        <w:rPr>
-          <w:rFonts w:asciiTheme="majorBidi" w:hAnsiTheme="majorBidi" w:cstheme="majorBidi"/>
-        </w:rPr>
-        <w:t>) function. Valid RSI values are used to determine the minimum and maximum RSI.</w:t>
+        <w:t>The function first calculates RSI values using the rsi() function. Valid RSI values are used to determine the minimum and maximum RSI.</w:t>
       </w:r>
     </w:p>
     <w:p>
@@ -2182,87 +1640,27 @@
           <w:rFonts w:asciiTheme="majorBidi" w:hAnsiTheme="majorBidi" w:cstheme="majorBidi"/>
         </w:rPr>
       </w:pPr>
-      <w:proofErr w:type="spellStart"/>
-      <w:r>
-        <w:rPr>
-          <w:rFonts w:asciiTheme="majorBidi" w:hAnsiTheme="majorBidi" w:cstheme="majorBidi"/>
-          <w:b/>
-          <w:bCs/>
-        </w:rPr>
-        <w:t>StochRSI</w:t>
-      </w:r>
-      <w:proofErr w:type="spellEnd"/>
-      <w:r>
-        <w:rPr>
-          <w:rFonts w:asciiTheme="majorBidi" w:hAnsiTheme="majorBidi" w:cstheme="majorBidi"/>
-          <w:b/>
-          <w:bCs/>
-        </w:rPr>
-        <w:t xml:space="preserve"> = (RSI − Minimum RSI) / (Maximum RSI − Minimum RSI)</w:t>
-      </w:r>
-    </w:p>
-    <w:p>
-      <w:pPr>
-        <w:ind w:left="360"/>
-        <w:rPr>
-          <w:rFonts w:asciiTheme="majorBidi" w:hAnsiTheme="majorBidi" w:cstheme="majorBidi"/>
-        </w:rPr>
-      </w:pPr>
-      <w:r>
-        <w:rPr>
-          <w:rFonts w:asciiTheme="majorBidi" w:hAnsiTheme="majorBidi" w:cstheme="majorBidi"/>
-        </w:rPr>
-        <w:t xml:space="preserve">The %K line is calculated by applying the </w:t>
-      </w:r>
-      <w:proofErr w:type="spellStart"/>
-      <w:proofErr w:type="gramStart"/>
-      <w:r>
-        <w:rPr>
-          <w:rFonts w:asciiTheme="majorBidi" w:hAnsiTheme="majorBidi" w:cstheme="majorBidi"/>
-        </w:rPr>
-        <w:t>sma</w:t>
-      </w:r>
-      <w:proofErr w:type="spellEnd"/>
-      <w:r>
-        <w:rPr>
-          <w:rFonts w:asciiTheme="majorBidi" w:hAnsiTheme="majorBidi" w:cstheme="majorBidi"/>
-        </w:rPr>
-        <w:t>(</w:t>
-      </w:r>
-      <w:proofErr w:type="gramEnd"/>
-      <w:r>
-        <w:rPr>
-          <w:rFonts w:asciiTheme="majorBidi" w:hAnsiTheme="majorBidi" w:cstheme="majorBidi"/>
-        </w:rPr>
-        <w:t xml:space="preserve">) function using </w:t>
-      </w:r>
-      <w:proofErr w:type="spellStart"/>
-      <w:r>
-        <w:rPr>
-          <w:rFonts w:asciiTheme="majorBidi" w:hAnsiTheme="majorBidi" w:cstheme="majorBidi"/>
-        </w:rPr>
-        <w:t>k_period</w:t>
-      </w:r>
-      <w:proofErr w:type="spellEnd"/>
-      <w:r>
-        <w:rPr>
-          <w:rFonts w:asciiTheme="majorBidi" w:hAnsiTheme="majorBidi" w:cstheme="majorBidi"/>
-        </w:rPr>
-        <w:t xml:space="preserve">. The %D line is then calculated as a moving average of the %K line using </w:t>
-      </w:r>
-      <w:proofErr w:type="spellStart"/>
-      <w:r>
-        <w:rPr>
-          <w:rFonts w:asciiTheme="majorBidi" w:hAnsiTheme="majorBidi" w:cstheme="majorBidi"/>
-        </w:rPr>
-        <w:t>d_period</w:t>
-      </w:r>
-      <w:proofErr w:type="spellEnd"/>
-      <w:r>
-        <w:rPr>
-          <w:rFonts w:asciiTheme="majorBidi" w:hAnsiTheme="majorBidi" w:cstheme="majorBidi"/>
-        </w:rPr>
-        <w:t>.</w:t>
+      <w:r>
+        <w:rPr>
+          <w:rFonts w:asciiTheme="majorBidi" w:hAnsiTheme="majorBidi" w:cstheme="majorBidi"/>
+          <w:b/>
+          <w:bCs/>
+        </w:rPr>
+        <w:t>StochRSI = (RSI − Minimum RSI) / (Maximum RSI − Minimum RSI)</w:t>
+      </w:r>
+    </w:p>
+    <w:p>
+      <w:pPr>
+        <w:ind w:left="360"/>
+        <w:rPr>
+          <w:rFonts w:asciiTheme="majorBidi" w:hAnsiTheme="majorBidi" w:cstheme="majorBidi"/>
+        </w:rPr>
+      </w:pPr>
+      <w:r>
+        <w:rPr>
+          <w:rFonts w:asciiTheme="majorBidi" w:hAnsiTheme="majorBidi" w:cstheme="majorBidi"/>
+        </w:rPr>
+        <w:t>The %K line is calculated by applying the sma() function using k_period. The %D line is then calculated as a moving average of the %K line using d_period.</w:t>
       </w:r>
     </w:p>
     <w:p>
@@ -2289,14 +1687,12 @@
           <w:rFonts w:asciiTheme="majorBidi" w:hAnsiTheme="majorBidi" w:cstheme="majorBidi"/>
         </w:rPr>
       </w:pPr>
-      <w:proofErr w:type="spellStart"/>
       <w:r>
         <w:rPr>
           <w:rFonts w:asciiTheme="majorBidi" w:hAnsiTheme="majorBidi" w:cstheme="majorBidi"/>
         </w:rPr>
         <w:t>k_line</w:t>
       </w:r>
-      <w:proofErr w:type="spellEnd"/>
     </w:p>
     <w:p>
       <w:pPr>
@@ -2308,29 +1704,27 @@
           <w:rFonts w:asciiTheme="majorBidi" w:hAnsiTheme="majorBidi" w:cstheme="majorBidi"/>
         </w:rPr>
       </w:pPr>
-      <w:proofErr w:type="spellStart"/>
-      <w:r>
-        <w:rPr>
-          <w:rFonts w:asciiTheme="majorBidi" w:hAnsiTheme="majorBidi" w:cstheme="majorBidi"/>
+      <w:r>
+        <w:rPr>
+          <w:rFonts w:asciiTheme="majorBidi" w:hAnsiTheme="majorBidi" w:cstheme="majorBidi"/>
+        </w:rPr>
+        <w:t>d_line</w:t>
+      </w:r>
+    </w:p>
+    <w:p>
+      <w:pPr>
+        <w:ind w:left="360"/>
+        <w:rPr>
+          <w:rFonts w:asciiTheme="majorBidi" w:hAnsiTheme="majorBidi" w:cstheme="majorBidi"/>
+        </w:rPr>
+      </w:pPr>
+      <w:r>
+        <w:rPr>
+          <w:rFonts w:asciiTheme="majorBidi" w:hAnsiTheme="majorBidi" w:cstheme="majorBidi"/>
+          <w:b/>
+          <w:bCs/>
         </w:rPr>
         <w:lastRenderedPageBreak/>
-        <w:t>d_line</w:t>
-      </w:r>
-      <w:proofErr w:type="spellEnd"/>
-    </w:p>
-    <w:p>
-      <w:pPr>
-        <w:ind w:left="360"/>
-        <w:rPr>
-          <w:rFonts w:asciiTheme="majorBidi" w:hAnsiTheme="majorBidi" w:cstheme="majorBidi"/>
-        </w:rPr>
-      </w:pPr>
-      <w:r>
-        <w:rPr>
-          <w:rFonts w:asciiTheme="majorBidi" w:hAnsiTheme="majorBidi" w:cstheme="majorBidi"/>
-          <w:b/>
-          <w:bCs/>
-        </w:rPr>
         <w:t>Example:</w:t>
       </w:r>
       <w:r>
@@ -2420,21 +1814,7 @@
         <w:rPr>
           <w:rFonts w:asciiTheme="majorBidi" w:hAnsiTheme="majorBidi" w:cstheme="majorBidi"/>
         </w:rPr>
-        <w:t xml:space="preserve"> </w:t>
-      </w:r>
-      <w:proofErr w:type="gramStart"/>
-      <w:r>
-        <w:rPr>
-          <w:rFonts w:asciiTheme="majorBidi" w:hAnsiTheme="majorBidi" w:cstheme="majorBidi"/>
-        </w:rPr>
-        <w:t>crossover(</w:t>
-      </w:r>
-      <w:proofErr w:type="gramEnd"/>
-      <w:r>
-        <w:rPr>
-          <w:rFonts w:asciiTheme="majorBidi" w:hAnsiTheme="majorBidi" w:cstheme="majorBidi"/>
-        </w:rPr>
-        <w:t>arr1, arr2)</w:t>
+        <w:t xml:space="preserve"> crossover(arr1, arr2)</w:t>
       </w:r>
     </w:p>
     <w:p>
@@ -2577,25 +1957,7 @@
           <w:b/>
           <w:bCs/>
         </w:rPr>
-        <w:t xml:space="preserve">9. </w:t>
-      </w:r>
-      <w:proofErr w:type="spellStart"/>
-      <w:r>
-        <w:rPr>
-          <w:rFonts w:asciiTheme="majorBidi" w:hAnsiTheme="majorBidi" w:cstheme="majorBidi"/>
-          <w:b/>
-          <w:bCs/>
-        </w:rPr>
-        <w:t>Crossunder</w:t>
-      </w:r>
-      <w:proofErr w:type="spellEnd"/>
-      <w:r>
-        <w:rPr>
-          <w:rFonts w:asciiTheme="majorBidi" w:hAnsiTheme="majorBidi" w:cstheme="majorBidi"/>
-          <w:b/>
-          <w:bCs/>
-        </w:rPr>
-        <w:t xml:space="preserve"> Function</w:t>
+        <w:t>9. Crossunder Function</w:t>
       </w:r>
     </w:p>
     <w:p>
@@ -2617,57 +1979,21 @@
         <w:rPr>
           <w:rFonts w:asciiTheme="majorBidi" w:hAnsiTheme="majorBidi" w:cstheme="majorBidi"/>
         </w:rPr>
-        <w:t xml:space="preserve"> </w:t>
-      </w:r>
-      <w:proofErr w:type="spellStart"/>
-      <w:proofErr w:type="gramStart"/>
-      <w:r>
-        <w:rPr>
-          <w:rFonts w:asciiTheme="majorBidi" w:hAnsiTheme="majorBidi" w:cstheme="majorBidi"/>
-        </w:rPr>
-        <w:t>crossunder</w:t>
-      </w:r>
-      <w:proofErr w:type="spellEnd"/>
-      <w:r>
-        <w:rPr>
-          <w:rFonts w:asciiTheme="majorBidi" w:hAnsiTheme="majorBidi" w:cstheme="majorBidi"/>
-        </w:rPr>
-        <w:t>(</w:t>
-      </w:r>
-      <w:proofErr w:type="gramEnd"/>
-      <w:r>
-        <w:rPr>
-          <w:rFonts w:asciiTheme="majorBidi" w:hAnsiTheme="majorBidi" w:cstheme="majorBidi"/>
-        </w:rPr>
-        <w:t>arr1, arr2)</w:t>
-      </w:r>
-    </w:p>
-    <w:p>
-      <w:pPr>
-        <w:ind w:left="360"/>
-        <w:rPr>
-          <w:rFonts w:asciiTheme="majorBidi" w:hAnsiTheme="majorBidi" w:cstheme="majorBidi"/>
-        </w:rPr>
-      </w:pPr>
-      <w:r>
-        <w:rPr>
-          <w:rFonts w:asciiTheme="majorBidi" w:hAnsiTheme="majorBidi" w:cstheme="majorBidi"/>
-        </w:rPr>
-        <w:t xml:space="preserve">The </w:t>
-      </w:r>
-      <w:proofErr w:type="spellStart"/>
-      <w:r>
-        <w:rPr>
-          <w:rFonts w:asciiTheme="majorBidi" w:hAnsiTheme="majorBidi" w:cstheme="majorBidi"/>
-        </w:rPr>
-        <w:t>Crossunder</w:t>
-      </w:r>
-      <w:proofErr w:type="spellEnd"/>
-      <w:r>
-        <w:rPr>
-          <w:rFonts w:asciiTheme="majorBidi" w:hAnsiTheme="majorBidi" w:cstheme="majorBidi"/>
-        </w:rPr>
-        <w:t xml:space="preserve"> function identifies when one data series crosses below another data series. It can be used to detect downward crossing signals between two indicators or sets of values.</w:t>
+        <w:t xml:space="preserve"> crossunder(arr1, arr2)</w:t>
+      </w:r>
+    </w:p>
+    <w:p>
+      <w:pPr>
+        <w:ind w:left="360"/>
+        <w:rPr>
+          <w:rFonts w:asciiTheme="majorBidi" w:hAnsiTheme="majorBidi" w:cstheme="majorBidi"/>
+        </w:rPr>
+      </w:pPr>
+      <w:r>
+        <w:rPr>
+          <w:rFonts w:asciiTheme="majorBidi" w:hAnsiTheme="majorBidi" w:cstheme="majorBidi"/>
+        </w:rPr>
+        <w:t>The Crossunder function identifies when one data series crosses below another data series. It can be used to detect downward crossing signals between two indicators or sets of values.</w:t>
       </w:r>
     </w:p>
     <w:p>
@@ -2724,21 +2050,7 @@
         <w:rPr>
           <w:rFonts w:asciiTheme="majorBidi" w:hAnsiTheme="majorBidi" w:cstheme="majorBidi"/>
         </w:rPr>
-        <w:t xml:space="preserve">"False" is returned when no </w:t>
-      </w:r>
-      <w:proofErr w:type="spellStart"/>
-      <w:r>
-        <w:rPr>
-          <w:rFonts w:asciiTheme="majorBidi" w:hAnsiTheme="majorBidi" w:cstheme="majorBidi"/>
-        </w:rPr>
-        <w:t>crossunder</w:t>
-      </w:r>
-      <w:proofErr w:type="spellEnd"/>
-      <w:r>
-        <w:rPr>
-          <w:rFonts w:asciiTheme="majorBidi" w:hAnsiTheme="majorBidi" w:cstheme="majorBidi"/>
-        </w:rPr>
-        <w:t xml:space="preserve"> occurs.</w:t>
+        <w:t>"False" is returned when no crossunder occurs.</w:t>
       </w:r>
     </w:p>
     <w:p>
@@ -2769,37 +2081,22 @@
         <w:rPr>
           <w:rFonts w:asciiTheme="majorBidi" w:hAnsiTheme="majorBidi" w:cstheme="majorBidi"/>
         </w:rPr>
-        <w:t xml:space="preserve">The function returns the complete vector of </w:t>
-      </w:r>
-      <w:proofErr w:type="spellStart"/>
-      <w:r>
-        <w:rPr>
-          <w:rFonts w:asciiTheme="majorBidi" w:hAnsiTheme="majorBidi" w:cstheme="majorBidi"/>
-        </w:rPr>
-        <w:t>crossunder</w:t>
-      </w:r>
-      <w:proofErr w:type="spellEnd"/>
-      <w:r>
-        <w:rPr>
-          <w:rFonts w:asciiTheme="majorBidi" w:hAnsiTheme="majorBidi" w:cstheme="majorBidi"/>
-        </w:rPr>
-        <w:t xml:space="preserve"> signals.</w:t>
-      </w:r>
-    </w:p>
-    <w:p>
-      <w:pPr>
-        <w:ind w:left="360"/>
-        <w:rPr>
-          <w:rFonts w:asciiTheme="majorBidi" w:hAnsiTheme="majorBidi" w:cstheme="majorBidi"/>
-        </w:rPr>
-      </w:pPr>
-      <w:r>
-        <w:rPr>
-          <w:rFonts w:asciiTheme="majorBidi" w:hAnsiTheme="majorBidi" w:cstheme="majorBidi"/>
-          <w:b/>
-          <w:bCs/>
-        </w:rPr>
-        <w:lastRenderedPageBreak/>
+        <w:t>The function returns the complete vector of crossunder signals.</w:t>
+      </w:r>
+    </w:p>
+    <w:p>
+      <w:pPr>
+        <w:ind w:left="360"/>
+        <w:rPr>
+          <w:rFonts w:asciiTheme="majorBidi" w:hAnsiTheme="majorBidi" w:cstheme="majorBidi"/>
+        </w:rPr>
+      </w:pPr>
+      <w:r>
+        <w:rPr>
+          <w:rFonts w:asciiTheme="majorBidi" w:hAnsiTheme="majorBidi" w:cstheme="majorBidi"/>
+          <w:b/>
+          <w:bCs/>
+        </w:rPr>
         <w:t>Example:</w:t>
       </w:r>
       <w:r>

</xml_diff>